<commit_message>
Update RFP docx with latest user edits in Word
Co-Authored-By: Claude Sonnet 5 <noreply@anthropic.com>
</commit_message>
<xml_diff>
--- a/public/OK금융그룹_2026-2027년_스마트러닝_위탁운영_제안요청서.docx
+++ b/public/OK금융그룹_2026-2027년_스마트러닝_위탁운영_제안요청서.docx
@@ -2971,6 +2971,119 @@
               <w:bottom w:val="single" w:sz="2" w:space="0" w:color="939393"/>
               <w:right w:val="nil"/>
             </w:tcBorders>
+            <w:shd w:val="clear" w:color="auto" w:fill="FFFFFF" w:themeFill="background1"/>
+            <w:tcMar>
+              <w:top w:w="28" w:type="dxa"/>
+              <w:left w:w="28" w:type="dxa"/>
+              <w:bottom w:w="28" w:type="dxa"/>
+              <w:right w:w="28" w:type="dxa"/>
+            </w:tcMar>
+            <w:vAlign w:val="center"/>
+          </w:tcPr>
+          <w:p>
+            <w:pPr>
+              <w:widowControl/>
+              <w:wordWrap/>
+              <w:autoSpaceDE/>
+              <w:autoSpaceDN/>
+              <w:snapToGrid w:val="0"/>
+              <w:spacing w:after="0" w:line="240" w:lineRule="auto"/>
+              <w:rPr>
+                <w:rFonts w:asciiTheme="majorHAnsi" w:eastAsiaTheme="majorHAnsi" w:hAnsiTheme="majorHAnsi"/>
+              </w:rPr>
+            </w:pPr>
+          </w:p>
+        </w:tc>
+        <w:tc>
+          <w:tcPr>
+            <w:tcW w:w="128" w:type="dxa"/>
+            <w:tcBorders>
+              <w:top w:val="nil"/>
+              <w:left w:val="nil"/>
+              <w:bottom w:val="nil"/>
+              <w:right w:val="nil"/>
+            </w:tcBorders>
+            <w:shd w:val="clear" w:color="auto" w:fill="FFFFFF" w:themeFill="background1"/>
+            <w:tcMar>
+              <w:top w:w="28" w:type="dxa"/>
+              <w:left w:w="11" w:type="dxa"/>
+              <w:bottom w:w="28" w:type="dxa"/>
+              <w:right w:w="11" w:type="dxa"/>
+            </w:tcMar>
+            <w:vAlign w:val="center"/>
+          </w:tcPr>
+          <w:p>
+            <w:pPr>
+              <w:widowControl/>
+              <w:wordWrap/>
+              <w:autoSpaceDE/>
+              <w:autoSpaceDN/>
+              <w:snapToGrid w:val="0"/>
+              <w:spacing w:after="0" w:line="240" w:lineRule="auto"/>
+              <w:rPr>
+                <w:rFonts w:asciiTheme="majorHAnsi" w:eastAsiaTheme="majorHAnsi" w:hAnsiTheme="majorHAnsi" w:cs="굴림"/>
+                <w:b/>
+                <w:color w:val="000000"/>
+                <w:kern w:val="0"/>
+                <w:szCs w:val="20"/>
+              </w:rPr>
+            </w:pPr>
+          </w:p>
+        </w:tc>
+        <w:tc>
+          <w:tcPr>
+            <w:tcW w:w="8473" w:type="dxa"/>
+            <w:gridSpan w:val="2"/>
+            <w:tcBorders>
+              <w:top w:val="nil"/>
+              <w:left w:val="nil"/>
+              <w:right w:val="nil"/>
+            </w:tcBorders>
+            <w:shd w:val="clear" w:color="auto" w:fill="FFFFFF" w:themeFill="background1"/>
+            <w:tcMar>
+              <w:top w:w="28" w:type="dxa"/>
+              <w:left w:w="28" w:type="dxa"/>
+              <w:bottom w:w="28" w:type="dxa"/>
+              <w:right w:w="28" w:type="dxa"/>
+            </w:tcMar>
+            <w:vAlign w:val="center"/>
+          </w:tcPr>
+          <w:p>
+            <w:pPr>
+              <w:widowControl/>
+              <w:wordWrap/>
+              <w:autoSpaceDE/>
+              <w:autoSpaceDN/>
+              <w:snapToGrid w:val="0"/>
+              <w:spacing w:after="0" w:line="240" w:lineRule="auto"/>
+              <w:jc w:val="left"/>
+              <w:rPr>
+                <w:rFonts w:asciiTheme="majorHAnsi" w:eastAsiaTheme="majorHAnsi" w:hAnsiTheme="majorHAnsi" w:cs="굴림" w:hint="eastAsia"/>
+                <w:b/>
+                <w:color w:val="000000"/>
+                <w:kern w:val="0"/>
+                <w:sz w:val="32"/>
+                <w:szCs w:val="32"/>
+              </w:rPr>
+            </w:pPr>
+          </w:p>
+        </w:tc>
+      </w:tr>
+      <w:tr>
+        <w:trPr>
+          <w:gridAfter w:val="1"/>
+          <w:wAfter w:w="200" w:type="dxa"/>
+          <w:trHeight w:val="466"/>
+        </w:trPr>
+        <w:tc>
+          <w:tcPr>
+            <w:tcW w:w="425" w:type="dxa"/>
+            <w:gridSpan w:val="2"/>
+            <w:tcBorders>
+              <w:left w:val="nil"/>
+              <w:bottom w:val="single" w:sz="2" w:space="0" w:color="939393"/>
+              <w:right w:val="nil"/>
+            </w:tcBorders>
             <w:shd w:val="clear" w:color="auto" w:fill="939393"/>
             <w:tcMar>
               <w:top w:w="28" w:type="dxa"/>
@@ -3023,7 +3136,6 @@
           <w:tcPr>
             <w:tcW w:w="128" w:type="dxa"/>
             <w:tcBorders>
-              <w:top w:val="nil"/>
               <w:left w:val="nil"/>
               <w:bottom w:val="nil"/>
               <w:right w:val="nil"/>
@@ -3060,7 +3172,6 @@
             <w:tcW w:w="8473" w:type="dxa"/>
             <w:gridSpan w:val="2"/>
             <w:tcBorders>
-              <w:top w:val="nil"/>
               <w:left w:val="nil"/>
               <w:bottom w:val="single" w:sz="2" w:space="0" w:color="939393"/>
               <w:right w:val="nil"/>
@@ -4715,6 +4826,7 @@
           <w:sz w:val="22"/>
           <w:szCs w:val="32"/>
         </w:rPr>
+        <w:lastRenderedPageBreak/>
         <w:t>❍</w:t>
       </w:r>
       <w:r>
@@ -4800,7 +4912,6 @@
           <w:sz w:val="22"/>
           <w:szCs w:val="32"/>
         </w:rPr>
-        <w:lastRenderedPageBreak/>
         <w:t>❍</w:t>
       </w:r>
       <w:r>
@@ -5374,20 +5485,7 @@
           <w:sz w:val="22"/>
           <w:szCs w:val="32"/>
         </w:rPr>
-        <w:t>위탁</w:t>
-      </w:r>
-      <w:bookmarkStart w:id="0" w:name="_GoBack"/>
-      <w:bookmarkEnd w:id="0"/>
-      <w:r>
-        <w:rPr>
-          <w:rFonts w:asciiTheme="majorHAnsi" w:eastAsiaTheme="majorHAnsi" w:hAnsiTheme="majorHAnsi" w:cs="굴림"/>
-          <w:bCs/>
-          <w:color w:val="000000"/>
-          <w:kern w:val="0"/>
-          <w:sz w:val="22"/>
-          <w:szCs w:val="32"/>
-        </w:rPr>
-        <w:t>운영기관의 DB에 등록된 당사 직원의 개인정보, 교육이력, 실적 등이</w:t>
+        <w:t>위탁운영기관의 DB에 등록된 당사 직원의 개인정보, 교육이력, 실적 등이</w:t>
       </w:r>
       <w:r>
         <w:rPr>
@@ -7422,6 +7520,17 @@
       </w:pPr>
       <w:r>
         <w:rPr>
+          <w:rFonts w:eastAsiaTheme="minorHAnsi" w:cs="굴림"/>
+          <w:bCs/>
+          <w:color w:val="000000"/>
+          <w:kern w:val="0"/>
+          <w:sz w:val="22"/>
+          <w:szCs w:val="32"/>
+        </w:rPr>
+        <w:t>4</w:t>
+      </w:r>
+      <w:r>
+        <w:rPr>
           <w:rFonts w:eastAsiaTheme="minorHAnsi" w:cs="굴림" w:hint="eastAsia"/>
           <w:bCs/>
           <w:color w:val="000000"/>
@@ -7429,7 +7538,7 @@
           <w:sz w:val="22"/>
           <w:szCs w:val="32"/>
         </w:rPr>
-        <w:t>3. 선정 절차</w:t>
+        <w:t>. 선정 절차</w:t>
       </w:r>
     </w:p>
     <w:p>
@@ -9141,6 +9250,17 @@
       </w:pPr>
       <w:r>
         <w:rPr>
+          <w:rFonts w:eastAsiaTheme="minorHAnsi" w:cs="굴림"/>
+          <w:bCs/>
+          <w:color w:val="000000"/>
+          <w:kern w:val="0"/>
+          <w:sz w:val="22"/>
+          <w:szCs w:val="32"/>
+        </w:rPr>
+        <w:t>5</w:t>
+      </w:r>
+      <w:r>
+        <w:rPr>
           <w:rFonts w:eastAsiaTheme="minorHAnsi" w:cs="굴림" w:hint="eastAsia"/>
           <w:bCs/>
           <w:color w:val="000000"/>
@@ -9148,7 +9268,7 @@
           <w:sz w:val="22"/>
           <w:szCs w:val="32"/>
         </w:rPr>
-        <w:t>4. 제출 서류</w:t>
+        <w:t>. 제출 서류</w:t>
       </w:r>
     </w:p>
     <w:p>
@@ -9932,25 +10052,34 @@
         <w:spacing w:before="240"/>
         <w:rPr>
           <w:rFonts w:asciiTheme="majorHAnsi" w:eastAsiaTheme="majorHAnsi" w:hAnsiTheme="majorHAnsi" w:cs="굴림"/>
-          <w:b/>
-          <w:bCs/>
-          <w:color w:val="000000"/>
-          <w:kern w:val="0"/>
-          <w:sz w:val="22"/>
-          <w:szCs w:val="32"/>
-        </w:rPr>
-      </w:pPr>
-      <w:r>
-        <w:rPr>
-          <w:rFonts w:asciiTheme="majorHAnsi" w:eastAsiaTheme="majorHAnsi" w:hAnsiTheme="majorHAnsi" w:cs="굴림" w:hint="eastAsia"/>
-          <w:b/>
-          <w:bCs/>
-          <w:color w:val="000000"/>
-          <w:kern w:val="0"/>
-          <w:sz w:val="22"/>
-          <w:szCs w:val="32"/>
-        </w:rPr>
-        <w:t>5. 제안서 주요 포함항목</w:t>
+          <w:bCs/>
+          <w:color w:val="000000"/>
+          <w:kern w:val="0"/>
+          <w:sz w:val="22"/>
+          <w:szCs w:val="32"/>
+        </w:rPr>
+      </w:pPr>
+      <w:r>
+        <w:rPr>
+          <w:rFonts w:asciiTheme="majorHAnsi" w:eastAsiaTheme="majorHAnsi" w:hAnsiTheme="majorHAnsi" w:cs="굴림"/>
+          <w:bCs/>
+          <w:color w:val="000000"/>
+          <w:kern w:val="0"/>
+          <w:sz w:val="22"/>
+          <w:szCs w:val="32"/>
+        </w:rPr>
+        <w:t>6</w:t>
+      </w:r>
+      <w:r>
+        <w:rPr>
+          <w:rFonts w:asciiTheme="majorHAnsi" w:eastAsiaTheme="majorHAnsi" w:hAnsiTheme="majorHAnsi" w:cs="굴림" w:hint="eastAsia"/>
+          <w:bCs/>
+          <w:color w:val="000000"/>
+          <w:kern w:val="0"/>
+          <w:sz w:val="22"/>
+          <w:szCs w:val="32"/>
+        </w:rPr>
+        <w:t>. 제안서 주요 포함항목</w:t>
       </w:r>
     </w:p>
     <w:tbl>
@@ -10218,7 +10347,18 @@
                 <w:kern w:val="0"/>
                 <w:szCs w:val="20"/>
               </w:rPr>
-              <w:t>제안업체 일반현황, 주요 연혁, 조직 및 인원현황</w:t>
+              <w:t>제안업체 일반현황, 주요 연혁</w:t>
+            </w:r>
+            <w:bookmarkStart w:id="0" w:name="_GoBack"/>
+            <w:bookmarkEnd w:id="0"/>
+            <w:r>
+              <w:rPr>
+                <w:rFonts w:asciiTheme="majorHAnsi" w:eastAsiaTheme="majorHAnsi" w:hAnsiTheme="majorHAnsi" w:cs="굴림" w:hint="eastAsia"/>
+                <w:color w:val="000000"/>
+                <w:kern w:val="0"/>
+                <w:szCs w:val="20"/>
+              </w:rPr>
+              <w:t>, 조직 및 인원현황</w:t>
             </w:r>
           </w:p>
         </w:tc>
@@ -20933,7 +21073,7 @@
 </file>
 
 <file path=customXml/itemProps1.xml><?xml version="1.0" encoding="utf-8"?>
-<ds:datastoreItem xmlns:ds="http://schemas.openxmlformats.org/officeDocument/2006/customXml" ds:itemID="{D45387AE-9133-4547-B5B9-C6B296D51562}">
+<ds:datastoreItem xmlns:ds="http://schemas.openxmlformats.org/officeDocument/2006/customXml" ds:itemID="{F1789824-CF6F-40CE-8953-102E09D32B2A}">
   <ds:schemaRefs>
     <ds:schemaRef ds:uri="http://schemas.openxmlformats.org/officeDocument/2006/bibliography"/>
   </ds:schemaRefs>

</xml_diff>